<commit_message>
Translate viet-clinic to Vietnamese (phase 2): code, DB comments/labels, and docs; keep IDs, codes, vendor libs, and reference data unchanged
</commit_message>
<xml_diff>
--- a/Code/medical2.0/back/db/云诊所沟代码逻辑梳理-顾烈华.docx
+++ b/Code/medical2.0/back/db/云诊所沟代码逻辑梳理-顾烈华.docx
@@ -18,7 +18,7 @@
           <w:rFonts w:hint="eastAsia"/>
           <w:lang w:val="en-US" w:eastAsia="zh-CN"/>
         </w:rPr>
-        <w:t>入库业务流程</w:t>
+        <w:t>Quy trình nghiệp vụ nhập kho</w:t>
       </w:r>
     </w:p>
     <w:p>
@@ -38,7 +38,7 @@
           <w:rFonts w:hint="eastAsia"/>
           <w:lang w:val="en-US" w:eastAsia="zh-CN"/>
         </w:rPr>
-        <w:t>添加入库单（supplier_storage）。</w:t>
+        <w:t>Thêm phiếu nhập kho (supplier_storage).</w:t>
       </w:r>
     </w:p>
     <w:p>
@@ -58,7 +58,7 @@
           <w:rFonts w:hint="eastAsia"/>
           <w:lang w:val="en-US" w:eastAsia="zh-CN"/>
         </w:rPr>
-        <w:t>添加入库单明细（supplier_stock），此时会在页面上完成计算最小包装数量然后传入。</w:t>
+        <w:t>Thêm chi tiết phiếu nhập kho (supplier_stock); lúc này việc tính số lượng đóng gói nhỏ nhất sẽ được hoàn thành trên trang rồi truyền vào.</w:t>
       </w:r>
     </w:p>
     <w:p>
@@ -78,7 +78,7 @@
           <w:rFonts w:hint="eastAsia"/>
           <w:lang w:val="en-US" w:eastAsia="zh-CN"/>
         </w:rPr>
-        <w:t>保存动态库存控制（medicinal_storage_control），记录本次操作的库存数量。</w:t>
+        <w:t>Lưu kiểm soát tồn kho động (medicinal_storage_control), ghi lại số lượng tồn kho của lần thao tác này.</w:t>
       </w:r>
     </w:p>
     <w:p>
@@ -98,7 +98,7 @@
           <w:rFonts w:hint="eastAsia"/>
           <w:lang w:val="en-US" w:eastAsia="zh-CN"/>
         </w:rPr>
-        <w:t>更新总库存控制（medicinal_stock_control），</w:t>
+        <w:t>Cập nhật kiểm soát tổng tồn kho (medicinal_stock_control),</w:t>
       </w:r>
     </w:p>
     <w:p>
@@ -118,7 +118,7 @@
           <w:rFonts w:hint="eastAsia"/>
           <w:lang w:val="en-US" w:eastAsia="zh-CN"/>
         </w:rPr>
-        <w:t>添加库存操作记录（medicinal_stock_record）</w:t>
+        <w:t>Thêm bản ghi thao tác tồn kho (medicinal_stock_record).</w:t>
       </w:r>
     </w:p>
     <w:p>
@@ -135,7 +135,7 @@
           <w:rFonts w:hint="eastAsia"/>
           <w:lang w:val="en-US" w:eastAsia="zh-CN"/>
         </w:rPr>
-        <w:t xml:space="preserve">添加药品 </w:t>
+        <w:t>Thêm thuốc</w:t>
       </w:r>
     </w:p>
     <w:p>
@@ -155,7 +155,7 @@
           <w:rFonts w:hint="eastAsia"/>
           <w:lang w:val="en-US" w:eastAsia="zh-CN"/>
         </w:rPr>
-        <w:t>添加药品信息（drug）</w:t>
+        <w:t>Thêm thông tin thuốc (drug).</w:t>
       </w:r>
     </w:p>
     <w:p>
@@ -175,7 +175,7 @@
           <w:rFonts w:hint="eastAsia"/>
           <w:lang w:val="en-US" w:eastAsia="zh-CN"/>
         </w:rPr>
-        <w:t>初始化总库存控制（medicinal_stock_control）</w:t>
+        <w:t>Khởi tạo kiểm soát tổng tồn kho (medicinal_stock_control).</w:t>
       </w:r>
     </w:p>
     <w:p>
@@ -192,7 +192,7 @@
           <w:rFonts w:hint="eastAsia"/>
           <w:lang w:val="en-US" w:eastAsia="zh-CN"/>
         </w:rPr>
-        <w:t>库存盘点</w:t>
+        <w:t>Kiểm kê tồn kho</w:t>
       </w:r>
     </w:p>
     <w:p>
@@ -212,7 +212,7 @@
           <w:rFonts w:hint="eastAsia"/>
           <w:lang w:val="en-US" w:eastAsia="zh-CN"/>
         </w:rPr>
-        <w:t>创建一条库存盘点记录（inventory_verification）</w:t>
+        <w:t>Tạo một bản ghi kiểm kê tồn kho (inventory_verification).</w:t>
       </w:r>
     </w:p>
     <w:p>
@@ -232,7 +232,7 @@
           <w:rFonts w:hint="eastAsia"/>
           <w:lang w:val="en-US" w:eastAsia="zh-CN"/>
         </w:rPr>
-        <w:t>根据动态库存记录生成盘点明细，生成时有个选项“是否包含零库存”。生成明细是依据动态库存管理表生成来的。（inventory_verification_detail）</w:t>
+        <w:t>Tạo chi tiết kiểm kê từ bản ghi tồn kho động; khi tạo có tùy chọn “Có bao gồm tồn kho bằng 0 hay không”. Chi tiết được tạo dựa trên bảng quản lý tồn kho động. (inventory_verification_detail)</w:t>
       </w:r>
     </w:p>
     <w:p>
@@ -252,7 +252,7 @@
           <w:rFonts w:hint="eastAsia"/>
           <w:lang w:val="en-US" w:eastAsia="zh-CN"/>
         </w:rPr>
-        <w:t>盘点时并不扣减库存，只更新DETAIL里的数据。完成盘点时才更新库存。更新库存时再找到动态库存表中的记录。对动态库存管理和总库存管理的总库存数量和可用库存数量进行增减。同时保存盘点记录表（inventoryVerificationRecord）</w:t>
+        <w:t>Khi kiểm kê thì không trừ tồn kho, chỉ cập nhật dữ liệu trong DETAIL. Chỉ khi hoàn thành kiểm kê mới cập nhật tồn kho. Khi cập nhật tồn kho, tìm lại bản ghi trong bảng tồn kho động, tăng/giảm tổng số lượng tồn kho và số lượng tồn kho khả dụng của quản lý tồn kho động và quản lý tổng tồn kho. Đồng thời lưu bảng bản ghi kiểm kê (inventoryVerificationRecord).</w:t>
       </w:r>
     </w:p>
     <w:p>
@@ -269,22 +269,22 @@
           <w:rFonts w:hint="eastAsia"/>
           <w:lang w:val="en-US" w:eastAsia="zh-CN"/>
         </w:rPr>
-        <w:t>其他</w:t>
-      </w:r>
-    </w:p>
-    <w:p>
-      <w:pPr>
-        <w:rPr>
-          <w:rFonts w:hint="eastAsia"/>
-          <w:lang w:val="en-US" w:eastAsia="zh-CN"/>
-        </w:rPr>
-      </w:pPr>
-      <w:r>
-        <w:rPr>
-          <w:rFonts w:hint="eastAsia"/>
-          <w:lang w:val="en-US" w:eastAsia="zh-CN"/>
-        </w:rPr>
-        <w:t>对象保存时会自动生成一个ID，貌似这个ID是不重复的，因为在库存控制里本来区分药品和材料，但是在查询时逻辑并未区分类型并结合ID进行查询，而是直接利用ID进行了查询。</w:t>
+        <w:t>Khác</w:t>
+      </w:r>
+    </w:p>
+    <w:p>
+      <w:pPr>
+        <w:rPr>
+          <w:rFonts w:hint="eastAsia"/>
+          <w:lang w:val="en-US" w:eastAsia="zh-CN"/>
+        </w:rPr>
+      </w:pPr>
+      <w:r>
+        <w:rPr>
+          <w:rFonts w:hint="eastAsia"/>
+          <w:lang w:val="en-US" w:eastAsia="zh-CN"/>
+        </w:rPr>
+        <w:t>Khi lưu đối tượng, hệ thống sẽ tự động tạo một ID; có vẻ ID này là không trùng lặp, vì trong kiểm soát tồn kho vốn phân biệt thuốc và vật tư, nhưng khi truy vấn, logic không phân biệt loại rồi kết hợp với ID để truy vấn mà truy vấn trực tiếp bằng ID.</w:t>
       </w:r>
     </w:p>
     <w:p>
@@ -309,7 +309,7 @@
           <w:rFonts w:hint="eastAsia"/>
           <w:lang w:val="en-US" w:eastAsia="zh-CN"/>
         </w:rPr>
-        <w:t>几个库存相关的数据表关系梳理</w:t>
+        <w:t>Rà soát quan hệ giữa một số bảng dữ liệu liên quan tới tồn kho</w:t>
       </w:r>
     </w:p>
     <w:p>
@@ -329,7 +329,7 @@
           <w:bCs/>
           <w:lang w:val="en-US" w:eastAsia="zh-CN"/>
         </w:rPr>
-        <w:t>药品信息（drug）</w:t>
+        <w:t>Thông tin thuốc (drug)</w:t>
       </w:r>
     </w:p>
     <w:p>
@@ -345,7 +345,7 @@
           <w:rFonts w:hint="eastAsia"/>
           <w:lang w:val="en-US" w:eastAsia="zh-CN"/>
         </w:rPr>
-        <w:t>保存药品信息，包含一生产厂家各种编码、制剂、拆零销售等相关信息。其中拆零的信息在入库以及计算价格的时候有用。</w:t>
+        <w:t>Lưu thông tin thuốc, bao gồm các mã của nhà sản xuất, dạng bào chế, bán lẻ tách lẻ và các thông tin liên quan khác. Trong đó, thông tin tách lẻ có ích khi nhập kho và khi tính giá.</w:t>
       </w:r>
     </w:p>
     <w:p>
@@ -365,16 +365,15 @@
           <w:bCs/>
           <w:lang w:val="en-US" w:eastAsia="zh-CN"/>
         </w:rPr>
-        <w:t>材料信息</w:t>
-      </w:r>
-      <w:r>
-        <w:rPr>
-          <w:rFonts w:hint="eastAsia"/>
-          <w:b/>
-          <w:bCs/>
-          <w:lang w:val="en-US" w:eastAsia="zh-CN"/>
-        </w:rPr>
-        <w:t>（stuff）</w:t>
+        <w:t>Thông tin vật tư (stuff)</w:t>
+      </w:r>
+      <w:r>
+        <w:rPr>
+          <w:rFonts w:hint="eastAsia"/>
+          <w:b/>
+          <w:bCs/>
+          <w:lang w:val="en-US" w:eastAsia="zh-CN"/>
+        </w:rPr>
       </w:r>
     </w:p>
     <w:p>
@@ -399,7 +398,7 @@
           <w:rFonts w:hint="eastAsia"/>
           <w:lang w:val="en-US" w:eastAsia="zh-CN"/>
         </w:rPr>
-        <w:t>保存材料信息目前还未仔细研究，估计是后加的。材料和药品共用库存管理逻辑和表结构，其中不少入库出库逻辑是分别的代码进行处理。</w:t>
+        <w:t>Lưu thông tin vật tư; hiện tại chưa nghiên cứu kỹ, ước chừng là được thêm vào sau. Vật tư và thuốc dùng chung logic quản lý tồn kho và cấu trúc bảng, trong đó không ít logic nhập kho / xuất kho được xử lý bằng mã nguồn riêng.</w:t>
       </w:r>
     </w:p>
     <w:p>
@@ -419,7 +418,7 @@
           <w:bCs/>
           <w:lang w:val="en-US" w:eastAsia="zh-CN"/>
         </w:rPr>
-        <w:t>药品/材料库存总控制（medicinal_stock_control）</w:t>
+        <w:t>Kiểm soát tổng tồn kho thuốc / vật tư (medicinal_stock_control)</w:t>
       </w:r>
     </w:p>
     <w:p>
@@ -435,7 +434,7 @@
           <w:rFonts w:hint="eastAsia"/>
           <w:lang w:val="en-US" w:eastAsia="zh-CN"/>
         </w:rPr>
-        <w:t>库存控制总表，材料和药品的总库存数量在这里体现但是不区分厂家和批号等。该表数据在入库出库时会动态进行更新。更新时会增加“库存操作记录”（medicinal_stock_record）。</w:t>
+        <w:t>Bảng tổng kiểm soát tồn kho; tổng số lượng tồn kho của vật tư và thuốc được thể hiện ở đây nhưng không phân biệt nhà sản xuất, số lô, v.v. Dữ liệu của bảng này sẽ được cập nhật động khi nhập kho / xuất kho. Khi cập nhật sẽ thêm “bản ghi thao tác tồn kho” (medicinal_stock_record).</w:t>
       </w:r>
     </w:p>
     <w:p>
@@ -455,16 +454,15 @@
           <w:bCs/>
           <w:lang w:val="en-US" w:eastAsia="zh-CN"/>
         </w:rPr>
-        <w:t>药品/材料入库明细控制</w:t>
-      </w:r>
-      <w:r>
-        <w:rPr>
-          <w:rFonts w:hint="eastAsia"/>
-          <w:b/>
-          <w:bCs/>
-          <w:lang w:val="en-US" w:eastAsia="zh-CN"/>
-        </w:rPr>
-        <w:t>（medicinal_storage_control）</w:t>
+        <w:t>Kiểm soát chi tiết nhập kho thuốc / vật tư (medicinal_storage_control)</w:t>
+      </w:r>
+      <w:r>
+        <w:rPr>
+          <w:rFonts w:hint="eastAsia"/>
+          <w:b/>
+          <w:bCs/>
+          <w:lang w:val="en-US" w:eastAsia="zh-CN"/>
+        </w:rPr>
       </w:r>
     </w:p>
     <w:p>
@@ -480,7 +478,7 @@
           <w:rFonts w:hint="eastAsia"/>
           <w:lang w:val="en-US" w:eastAsia="zh-CN"/>
         </w:rPr>
-        <w:t>代码中叫作动态库存控制，这里保存了各个厂家、批号的当前库存信息。如果要出入库，首先应该是从这里进行查询，然后同步更新“药品/材料库存总控制”同添加“库存操作记录”。该表数据更新来源包含入库、盘点（盘点会更新它）。</w:t>
+        <w:t>Trong mã nguồn gọi là kiểm soát tồn kho động; ở đây lưu thông tin tồn kho hiện tại của từng nhà sản xuất, số lô. Nếu muốn nhập kho / xuất kho, trước hết nên truy vấn từ đây, sau đó đồng bộ cập nhật “kiểm soát tổng tồn kho thuốc / vật tư” và thêm “bản ghi thao tác tồn kho”. Nguồn cập nhật dữ liệu của bảng này gồm nhập kho, kiểm kê (kiểm kê sẽ cập nhật bảng này).</w:t>
       </w:r>
     </w:p>
     <w:p>
@@ -500,16 +498,15 @@
           <w:bCs/>
           <w:lang w:val="en-US" w:eastAsia="zh-CN"/>
         </w:rPr>
-        <w:t>供应商库存</w:t>
-      </w:r>
-      <w:r>
-        <w:rPr>
-          <w:rFonts w:hint="eastAsia"/>
-          <w:b/>
-          <w:bCs/>
-          <w:lang w:val="en-US" w:eastAsia="zh-CN"/>
-        </w:rPr>
-        <w:t>（supplier_stock）</w:t>
+        <w:t>Tồn kho nhà cung cấp (supplier_stock)</w:t>
+      </w:r>
+      <w:r>
+        <w:rPr>
+          <w:rFonts w:hint="eastAsia"/>
+          <w:b/>
+          <w:bCs/>
+          <w:lang w:val="en-US" w:eastAsia="zh-CN"/>
+        </w:rPr>
       </w:r>
     </w:p>
     <w:p>
@@ -525,21 +522,19 @@
           <w:rFonts w:hint="eastAsia"/>
           <w:lang w:val="en-US" w:eastAsia="zh-CN"/>
         </w:rPr>
-        <w:t>这里主要保存每次入库的批号、厂家等信息，“</w:t>
-      </w:r>
-      <w:r>
-        <w:rPr>
-          <w:rFonts w:hint="default"/>
-          <w:lang w:val="en-US" w:eastAsia="zh-CN"/>
-        </w:rPr>
-        <w:t>药品/材料入库明细控制</w:t>
-      </w:r>
-      <w:r>
-        <w:rPr>
-          <w:rFonts w:hint="eastAsia"/>
-          <w:lang w:val="en-US" w:eastAsia="zh-CN"/>
-        </w:rPr>
-        <w:t>”会关联到此表，查询库存时如果要查询批号等信息就从这里来。</w:t>
+        <w:t>Ở đây chủ yếu lưu thông tin số lô, nhà sản xuất, v.v. của mỗi lần nhập kho; “kiểm soát chi tiết nhập kho thuốc / vật tư” sẽ liên kết tới bảng này; khi truy vấn tồn kho, nếu cần truy vấn thông tin số lô, v.v. thì lấy từ đây.</w:t>
+      </w:r>
+      <w:r>
+        <w:rPr>
+          <w:rFonts w:hint="default"/>
+          <w:lang w:val="en-US" w:eastAsia="zh-CN"/>
+        </w:rPr>
+      </w:r>
+      <w:r>
+        <w:rPr>
+          <w:rFonts w:hint="eastAsia"/>
+          <w:lang w:val="en-US" w:eastAsia="zh-CN"/>
+        </w:rPr>
       </w:r>
     </w:p>
     <w:p>
@@ -555,7 +550,7 @@
           <w:rFonts w:hint="eastAsia"/>
           <w:lang w:val="en-US" w:eastAsia="zh-CN"/>
         </w:rPr>
-        <w:t>特别说明：supplier_stock和medicinal_storage_control通过supplier.id = storage.storage_id进行关联。</w:t>
+        <w:t>Lưu ý đặc biệt: supplier_stock và medicinal_storage_control liên kết với nhau qua supplier.id = storage.storage_id.</w:t>
       </w:r>
     </w:p>
     <w:p>
@@ -575,16 +570,15 @@
           <w:bCs/>
           <w:lang w:val="en-US" w:eastAsia="zh-CN"/>
         </w:rPr>
-        <w:t>库存盘点</w:t>
-      </w:r>
-      <w:r>
-        <w:rPr>
-          <w:rFonts w:hint="eastAsia"/>
-          <w:b/>
-          <w:bCs/>
-          <w:lang w:val="en-US" w:eastAsia="zh-CN"/>
-        </w:rPr>
-        <w:t>（inventory_verification）</w:t>
+        <w:t>Kiểm kê tồn kho (inventory_verification)</w:t>
+      </w:r>
+      <w:r>
+        <w:rPr>
+          <w:rFonts w:hint="eastAsia"/>
+          <w:b/>
+          <w:bCs/>
+          <w:lang w:val="en-US" w:eastAsia="zh-CN"/>
+        </w:rPr>
       </w:r>
     </w:p>
     <w:p>
@@ -600,7 +594,7 @@
           <w:rFonts w:hint="eastAsia"/>
           <w:lang w:val="en-US" w:eastAsia="zh-CN"/>
         </w:rPr>
-        <w:t>当进行盘点时会在此表增加一条记录，同时针对要盘点的内容增加明细到“库存盘点详情”（inventory_verification_detail），在盘点期间会对此表进行更新，未结束盘点前不更新库存。</w:t>
+        <w:t>Khi tiến hành kiểm kê, bảng này sẽ thêm một bản ghi, đồng thời thêm chi tiết cho nội dung cần kiểm kê vào “chi tiết kiểm kê tồn kho” (inventory_verification_detail); trong thời gian kiểm kê, bảng này sẽ được cập nhật, trước khi kết thúc kiểm kê thì không cập nhật tồn kho.</w:t>
       </w:r>
     </w:p>
     <w:p>
@@ -620,16 +614,15 @@
           <w:bCs/>
           <w:lang w:val="en-US" w:eastAsia="zh-CN"/>
         </w:rPr>
-        <w:t>库存盘点详情</w:t>
-      </w:r>
-      <w:r>
-        <w:rPr>
-          <w:rFonts w:hint="eastAsia"/>
-          <w:b/>
-          <w:bCs/>
-          <w:lang w:val="en-US" w:eastAsia="zh-CN"/>
-        </w:rPr>
-        <w:t>（inventory_verification_detail）</w:t>
+        <w:t>Chi tiết kiểm kê tồn kho (inventory_verification_detail)</w:t>
+      </w:r>
+      <w:r>
+        <w:rPr>
+          <w:rFonts w:hint="eastAsia"/>
+          <w:b/>
+          <w:bCs/>
+          <w:lang w:val="en-US" w:eastAsia="zh-CN"/>
+        </w:rPr>
       </w:r>
     </w:p>
     <w:p>
@@ -645,21 +638,19 @@
           <w:rFonts w:hint="eastAsia"/>
           <w:lang w:val="en-US" w:eastAsia="zh-CN"/>
         </w:rPr>
-        <w:t>盘点明细表，创建盘点时根据选择“是否包含零库存”从“</w:t>
-      </w:r>
-      <w:r>
-        <w:rPr>
-          <w:rFonts w:hint="default"/>
-          <w:lang w:val="en-US" w:eastAsia="zh-CN"/>
-        </w:rPr>
-        <w:t>药品/材料入库明细控制</w:t>
-      </w:r>
-      <w:r>
-        <w:rPr>
-          <w:rFonts w:hint="eastAsia"/>
-          <w:lang w:val="en-US" w:eastAsia="zh-CN"/>
-        </w:rPr>
-        <w:t>”（medicinal_storage_control）生成盘点明细数据，盘点期间只更新。结束盘点时根据此表信息更新库存，并根据盘点是否变化保存“库存盘点记录”（inventory_verification_record）。</w:t>
+        <w:t>Bảng chi tiết kiểm kê; khi tạo kiểm kê, dựa trên lựa chọn “Có bao gồm tồn kho bằng 0 hay không” để tạo dữ liệu chi tiết kiểm kê từ “kiểm soát chi tiết nhập kho thuốc / vật tư” (medicinal_storage_control); trong thời gian kiểm kê chỉ cập nhật. Khi kết thúc kiểm kê, cập nhật tồn kho theo thông tin của bảng này và lưu “bản ghi kiểm kê tồn kho” (inventory_verification_record) tùy theo việc kiểm kê có thay đổi hay không.</w:t>
+      </w:r>
+      <w:r>
+        <w:rPr>
+          <w:rFonts w:hint="default"/>
+          <w:lang w:val="en-US" w:eastAsia="zh-CN"/>
+        </w:rPr>
+      </w:r>
+      <w:r>
+        <w:rPr>
+          <w:rFonts w:hint="eastAsia"/>
+          <w:lang w:val="en-US" w:eastAsia="zh-CN"/>
+        </w:rPr>
       </w:r>
     </w:p>
     <w:p>
@@ -679,7 +670,7 @@
           <w:bCs/>
           <w:lang w:val="en-US" w:eastAsia="zh-CN"/>
         </w:rPr>
-        <w:t>库存盘点记录（inventory_verification_record）</w:t>
+        <w:t>Bản ghi kiểm kê tồn kho (inventory_verification_record)</w:t>
       </w:r>
     </w:p>
     <w:p>
@@ -695,7 +686,7 @@
           <w:rFonts w:hint="eastAsia"/>
           <w:lang w:val="en-US" w:eastAsia="zh-CN"/>
         </w:rPr>
-        <w:t>当结束盘点时如果库存有变化，会保存一条记录到此表中。</w:t>
+        <w:t>Khi kết thúc kiểm kê, nếu tồn kho có thay đổi, một bản ghi sẽ được lưu vào bảng này.</w:t>
       </w:r>
     </w:p>
     <w:p>
@@ -728,22 +719,22 @@
           <w:rFonts w:hint="eastAsia"/>
           <w:lang w:val="en-US" w:eastAsia="zh-CN"/>
         </w:rPr>
-        <w:t>菜单图标</w:t>
-      </w:r>
-    </w:p>
-    <w:p>
-      <w:pPr>
-        <w:rPr>
-          <w:rFonts w:hint="default"/>
-          <w:lang w:val="en-US" w:eastAsia="zh-CN"/>
-        </w:rPr>
-      </w:pPr>
-      <w:r>
-        <w:rPr>
-          <w:rFonts w:hint="eastAsia"/>
-          <w:lang w:val="en-US" w:eastAsia="zh-CN"/>
-        </w:rPr>
-        <w:t>菜单和路由是在系统管理员界面进行配置的。但图标配置项在菜单的cssClass里进行配置，取值为\src\icons\svg目录下的svg文件，可用浏览器打开进行图标预览。</w:t>
+        <w:t>Biểu tượng menu</w:t>
+      </w:r>
+    </w:p>
+    <w:p>
+      <w:pPr>
+        <w:rPr>
+          <w:rFonts w:hint="default"/>
+          <w:lang w:val="en-US" w:eastAsia="zh-CN"/>
+        </w:rPr>
+      </w:pPr>
+      <w:r>
+        <w:rPr>
+          <w:rFonts w:hint="eastAsia"/>
+          <w:lang w:val="en-US" w:eastAsia="zh-CN"/>
+        </w:rPr>
+        <w:t>Menu và route được cấu hình trên giao diện quản trị hệ thống. Nhưng mục cấu hình biểu tượng được cấu hình trong cssClass của menu, giá trị là tệp svg trong thư mục \src\icons\svg, có thể mở bằng trình duyệt để xem trước biểu tượng.</w:t>
       </w:r>
     </w:p>
     <w:p>
@@ -760,7 +751,7 @@
           <w:rFonts w:hint="eastAsia"/>
           <w:lang w:val="en-US" w:eastAsia="zh-CN"/>
         </w:rPr>
-        <w:t>前端代码写法说明</w:t>
+        <w:t>Giải thích cách viết mã nguồn front-end</w:t>
       </w:r>
     </w:p>
     <w:p>
@@ -777,22 +768,22 @@
           <w:rFonts w:hint="eastAsia"/>
           <w:lang w:val="en-US" w:eastAsia="zh-CN"/>
         </w:rPr>
-        <w:t>（重要）控件封装</w:t>
-      </w:r>
-    </w:p>
-    <w:p>
-      <w:pPr>
-        <w:rPr>
-          <w:rFonts w:hint="eastAsia"/>
-          <w:lang w:val="en-US" w:eastAsia="zh-CN"/>
-        </w:rPr>
-      </w:pPr>
-      <w:r>
-        <w:rPr>
-          <w:rFonts w:hint="eastAsia"/>
-          <w:lang w:val="en-US" w:eastAsia="zh-CN"/>
-        </w:rPr>
-        <w:t>原前端代码中有大量应封装的控件未进行必要的封装，而是直接写在页面代码中。造成页面代码复杂，难以维护，且重用率较低。现已经封装了部分控件在views/components目录中，每个控件新建一个目录，可参考supplier-select控件。</w:t>
+        <w:t>(Quan trọng) Đóng gói control</w:t>
+      </w:r>
+    </w:p>
+    <w:p>
+      <w:pPr>
+        <w:rPr>
+          <w:rFonts w:hint="eastAsia"/>
+          <w:lang w:val="en-US" w:eastAsia="zh-CN"/>
+        </w:rPr>
+      </w:pPr>
+      <w:r>
+        <w:rPr>
+          <w:rFonts w:hint="eastAsia"/>
+          <w:lang w:val="en-US" w:eastAsia="zh-CN"/>
+        </w:rPr>
+        <w:t>Trong mã nguồn front-end gốc, có nhiều control đáng lẽ phải đóng gói nhưng chưa được đóng gói cần thiết mà viết trực tiếp trong mã nguồn trang, khiến mã nguồn trang phức tạp, khó bảo trì và tỷ lệ tái sử dụng thấp. Hiện đã đóng gói một phần control trong thư mục views/components; mỗi control tạo một thư mục mới, có thể tham khảo control supplier-select.</w:t>
       </w:r>
     </w:p>
     <w:p>
@@ -809,199 +800,193 @@
           <w:rFonts w:hint="eastAsia"/>
           <w:lang w:val="en-US" w:eastAsia="zh-CN"/>
         </w:rPr>
-        <w:t>已封装可重用控件(在views/components)</w:t>
-      </w:r>
-    </w:p>
-    <w:p>
-      <w:pPr>
-        <w:rPr>
-          <w:rFonts w:hint="eastAsia"/>
-          <w:lang w:val="en-US" w:eastAsia="zh-CN"/>
-        </w:rPr>
-      </w:pPr>
-      <w:r>
-        <w:rPr>
-          <w:rFonts w:hint="eastAsia"/>
-          <w:lang w:val="en-US" w:eastAsia="zh-CN"/>
-        </w:rPr>
-        <w:t>Dict-item-select--数据字典选择控件，提供数据字典的下拉选择功能。</w:t>
-      </w:r>
-    </w:p>
-    <w:p>
-      <w:pPr>
-        <w:rPr>
-          <w:rFonts w:hint="eastAsia"/>
-          <w:lang w:val="en-US" w:eastAsia="zh-CN"/>
-        </w:rPr>
-      </w:pPr>
-      <w:r>
-        <w:rPr>
-          <w:rFonts w:hint="eastAsia"/>
-          <w:lang w:val="en-US" w:eastAsia="zh-CN"/>
-        </w:rPr>
-        <w:t>Dict-item-view--数字字典名称显示控件，可直接根据数字字典的值显示其名称，不再需要在查询时即查询出字典的name值。</w:t>
-      </w:r>
-    </w:p>
-    <w:p>
-      <w:pPr>
-        <w:rPr>
-          <w:rFonts w:hint="eastAsia"/>
-          <w:lang w:val="en-US" w:eastAsia="zh-CN"/>
-        </w:rPr>
-      </w:pPr>
-      <w:r>
-        <w:rPr>
-          <w:rFonts w:hint="default"/>
-          <w:lang w:val="en-US" w:eastAsia="zh-CN"/>
-        </w:rPr>
-        <w:t>drug-stuff-storage-select</w:t>
-      </w:r>
-      <w:r>
-        <w:rPr>
-          <w:rFonts w:hint="eastAsia"/>
-          <w:lang w:val="en-US" w:eastAsia="zh-CN"/>
-        </w:rPr>
-        <w:t>--药品材料动态库存选择控件，可以在指定了供应商和物品类型后提供物品选择功能，目前用在出库单添加和修改界面。</w:t>
-      </w:r>
-    </w:p>
-    <w:p>
-      <w:pPr>
-        <w:rPr>
-          <w:rFonts w:hint="eastAsia"/>
-          <w:lang w:val="en-US" w:eastAsia="zh-CN"/>
-        </w:rPr>
-      </w:pPr>
-      <w:r>
-        <w:rPr>
-          <w:rFonts w:hint="default"/>
-          <w:lang w:val="en-US" w:eastAsia="zh-CN"/>
-        </w:rPr>
-        <w:t>drug-stuff-type-select</w:t>
-      </w:r>
-      <w:r>
-        <w:rPr>
-          <w:rFonts w:hint="eastAsia"/>
-          <w:lang w:val="en-US" w:eastAsia="zh-CN"/>
-        </w:rPr>
-        <w:t>--材料类型选择控件，用于选择是药品或是材料。</w:t>
-      </w:r>
-    </w:p>
-    <w:p>
-      <w:pPr>
-        <w:rPr>
-          <w:rFonts w:hint="eastAsia"/>
-          <w:lang w:val="en-US" w:eastAsia="zh-CN"/>
-        </w:rPr>
-      </w:pPr>
-      <w:r>
-        <w:rPr>
-          <w:rFonts w:hint="default"/>
-          <w:lang w:val="en-US" w:eastAsia="zh-CN"/>
-        </w:rPr>
-        <w:t>search-item</w:t>
-      </w:r>
-      <w:r>
-        <w:rPr>
-          <w:rFonts w:hint="eastAsia"/>
-          <w:lang w:val="en-US" w:eastAsia="zh-CN"/>
-        </w:rPr>
-        <w:t>--用于显示在查询条件区域的查询条件控件布局，提供一个label属性用来显示标题，具体的条件控件通过插槽置入。用法可参考supplierOutbound/index页面。</w:t>
-      </w:r>
-    </w:p>
-    <w:p>
-      <w:pPr>
-        <w:rPr>
-          <w:rFonts w:hint="eastAsia"/>
-          <w:lang w:val="en-US" w:eastAsia="zh-CN"/>
-        </w:rPr>
-      </w:pPr>
-      <w:r>
-        <w:rPr>
-          <w:rFonts w:hint="default"/>
-          <w:lang w:val="en-US" w:eastAsia="zh-CN"/>
-        </w:rPr>
-        <w:t>supplier-outbound-method-select</w:t>
-      </w:r>
-      <w:r>
-        <w:rPr>
-          <w:rFonts w:hint="eastAsia"/>
-          <w:lang w:val="en-US" w:eastAsia="zh-CN"/>
-        </w:rPr>
-        <w:t>--已弃用，可直接用Dict-item-select代替。</w:t>
-      </w:r>
-    </w:p>
-    <w:p>
-      <w:pPr>
-        <w:rPr>
-          <w:rFonts w:hint="default"/>
-          <w:lang w:val="en-US" w:eastAsia="zh-CN"/>
-        </w:rPr>
-      </w:pPr>
-      <w:r>
-        <w:rPr>
-          <w:rFonts w:hint="eastAsia"/>
-          <w:lang w:val="en-US" w:eastAsia="zh-CN"/>
-        </w:rPr>
-        <w:t>supplier-outbound-status-select--出库单状态选择控件，用于出库单状态选择控件，目前主要用于查询条件。</w:t>
-      </w:r>
-    </w:p>
-    <w:p>
-      <w:pPr>
-        <w:rPr>
-          <w:rFonts w:hint="default"/>
-          <w:lang w:val="en-US" w:eastAsia="zh-CN"/>
-        </w:rPr>
-      </w:pPr>
-      <w:r>
-        <w:rPr>
-          <w:rFonts w:hint="eastAsia"/>
-          <w:lang w:val="en-US" w:eastAsia="zh-CN"/>
-        </w:rPr>
-        <w:t>supplier-outbound-status-view--出库单状态显示控件，用于显示不同状态值对应的状态名称</w:t>
-      </w:r>
-    </w:p>
-    <w:p>
-      <w:pPr>
-        <w:rPr>
-          <w:rFonts w:hint="default"/>
-          <w:lang w:val="en-US" w:eastAsia="zh-CN"/>
-        </w:rPr>
-      </w:pPr>
-      <w:r>
-        <w:rPr>
-          <w:rFonts w:hint="default"/>
-          <w:lang w:val="en-US" w:eastAsia="zh-CN"/>
-        </w:rPr>
-        <w:t>supplier-select</w:t>
-      </w:r>
-      <w:r>
-        <w:rPr>
-          <w:rFonts w:hint="eastAsia"/>
-          <w:lang w:val="en-US" w:eastAsia="zh-CN"/>
-        </w:rPr>
-        <w:t>--供应商选择控件。</w:t>
-      </w:r>
-    </w:p>
-    <w:p>
-      <w:pPr>
-        <w:rPr>
-          <w:rFonts w:hint="default"/>
-          <w:lang w:val="en-US" w:eastAsia="zh-CN"/>
-        </w:rPr>
-      </w:pPr>
-      <w:r>
-        <w:rPr>
-          <w:rFonts w:hint="default"/>
-          <w:lang w:val="en-US" w:eastAsia="zh-CN"/>
-        </w:rPr>
-        <w:t>addstorageTo</w:t>
-      </w:r>
-      <w:r>
-        <w:rPr>
-          <w:rFonts w:hint="eastAsia"/>
-          <w:lang w:val="en-US" w:eastAsia="zh-CN"/>
-        </w:rPr>
-        <w:t>--出库单添加和修改界面，这是在原出库单界面控件上进行优化修改后的写法，可作其他弹窗控件的参考。不再像原来那样仅提供界面，弹窗控件由调用页面来处理。现在将所有逻辑都封装在控件里。</w:t>
+        <w:t>Các control đã đóng gói, có thể tái sử dụng (trong views/components)</w:t>
+      </w:r>
+    </w:p>
+    <w:p>
+      <w:pPr>
+        <w:rPr>
+          <w:rFonts w:hint="eastAsia"/>
+          <w:lang w:val="en-US" w:eastAsia="zh-CN"/>
+        </w:rPr>
+      </w:pPr>
+      <w:r>
+        <w:rPr>
+          <w:rFonts w:hint="eastAsia"/>
+          <w:lang w:val="en-US" w:eastAsia="zh-CN"/>
+        </w:rPr>
+        <w:t>Dict-item-select – Control chọn từ điển dữ liệu, cung cấp chức năng chọn từ danh sách thả xuống của từ điển dữ liệu.</w:t>
+      </w:r>
+    </w:p>
+    <w:p>
+      <w:pPr>
+        <w:rPr>
+          <w:rFonts w:hint="eastAsia"/>
+          <w:lang w:val="en-US" w:eastAsia="zh-CN"/>
+        </w:rPr>
+      </w:pPr>
+      <w:r>
+        <w:rPr>
+          <w:rFonts w:hint="eastAsia"/>
+          <w:lang w:val="en-US" w:eastAsia="zh-CN"/>
+        </w:rPr>
+        <w:t>Dict-item-view – Control hiển thị tên của từ điển số, có thể hiển thị trực tiếp tên theo giá trị của từ điển số, không cần truy vấn ra giá trị name của từ điển ngay khi truy vấn nữa.</w:t>
+      </w:r>
+    </w:p>
+    <w:p>
+      <w:pPr>
+        <w:rPr>
+          <w:rFonts w:hint="eastAsia"/>
+          <w:lang w:val="en-US" w:eastAsia="zh-CN"/>
+        </w:rPr>
+      </w:pPr>
+      <w:r>
+        <w:rPr>
+          <w:rFonts w:hint="default"/>
+          <w:lang w:val="en-US" w:eastAsia="zh-CN"/>
+        </w:rPr>
+        <w:t>drug-stuff-storage-select – Control chọn tồn kho động thuốc / vật tư, sau khi chỉ định nhà cung cấp và loại mặt hàng có thể cung cấp chức năng chọn mặt hàng, hiện dùng trên giao diện thêm và sửa phiếu xuất kho.</w:t>
+      </w:r>
+      <w:r>
+        <w:rPr>
+          <w:rFonts w:hint="eastAsia"/>
+          <w:lang w:val="en-US" w:eastAsia="zh-CN"/>
+        </w:rPr>
+      </w:r>
+    </w:p>
+    <w:p>
+      <w:pPr>
+        <w:rPr>
+          <w:rFonts w:hint="eastAsia"/>
+          <w:lang w:val="en-US" w:eastAsia="zh-CN"/>
+        </w:rPr>
+      </w:pPr>
+      <w:r>
+        <w:rPr>
+          <w:rFonts w:hint="default"/>
+          <w:lang w:val="en-US" w:eastAsia="zh-CN"/>
+        </w:rPr>
+        <w:t>drug-stuff-type-select – Control chọn loại vật tư, dùng để chọn là thuốc hay vật tư.</w:t>
+      </w:r>
+      <w:r>
+        <w:rPr>
+          <w:rFonts w:hint="eastAsia"/>
+          <w:lang w:val="en-US" w:eastAsia="zh-CN"/>
+        </w:rPr>
+      </w:r>
+    </w:p>
+    <w:p>
+      <w:pPr>
+        <w:rPr>
+          <w:rFonts w:hint="eastAsia"/>
+          <w:lang w:val="en-US" w:eastAsia="zh-CN"/>
+        </w:rPr>
+      </w:pPr>
+      <w:r>
+        <w:rPr>
+          <w:rFonts w:hint="default"/>
+          <w:lang w:val="en-US" w:eastAsia="zh-CN"/>
+        </w:rPr>
+        <w:t>search-item – Dùng để hiển thị bố cục của control điều kiện tra cứu trong khu vực điều kiện tra cứu, cung cấp một thuộc tính label để hiển thị tiêu đề; các control điều kiện cụ thể được đưa vào qua slot. Cách dùng có thể tham khảo trang supplierOutbound/index.</w:t>
+      </w:r>
+      <w:r>
+        <w:rPr>
+          <w:rFonts w:hint="eastAsia"/>
+          <w:lang w:val="en-US" w:eastAsia="zh-CN"/>
+        </w:rPr>
+      </w:r>
+    </w:p>
+    <w:p>
+      <w:pPr>
+        <w:rPr>
+          <w:rFonts w:hint="eastAsia"/>
+          <w:lang w:val="en-US" w:eastAsia="zh-CN"/>
+        </w:rPr>
+      </w:pPr>
+      <w:r>
+        <w:rPr>
+          <w:rFonts w:hint="default"/>
+          <w:lang w:val="en-US" w:eastAsia="zh-CN"/>
+        </w:rPr>
+        <w:t>supplier-outbound-method-select – Đã ngừng dùng, có thể thay trực tiếp bằng Dict-item-select.</w:t>
+      </w:r>
+      <w:r>
+        <w:rPr>
+          <w:rFonts w:hint="eastAsia"/>
+          <w:lang w:val="en-US" w:eastAsia="zh-CN"/>
+        </w:rPr>
+      </w:r>
+    </w:p>
+    <w:p>
+      <w:pPr>
+        <w:rPr>
+          <w:rFonts w:hint="default"/>
+          <w:lang w:val="en-US" w:eastAsia="zh-CN"/>
+        </w:rPr>
+      </w:pPr>
+      <w:r>
+        <w:rPr>
+          <w:rFonts w:hint="eastAsia"/>
+          <w:lang w:val="en-US" w:eastAsia="zh-CN"/>
+        </w:rPr>
+        <w:t>supplier-outbound-status-select – Control chọn trạng thái phiếu xuất kho, dùng làm control chọn trạng thái phiếu xuất kho, hiện chủ yếu dùng cho điều kiện tra cứu.</w:t>
+      </w:r>
+    </w:p>
+    <w:p>
+      <w:pPr>
+        <w:rPr>
+          <w:rFonts w:hint="default"/>
+          <w:lang w:val="en-US" w:eastAsia="zh-CN"/>
+        </w:rPr>
+      </w:pPr>
+      <w:r>
+        <w:rPr>
+          <w:rFonts w:hint="eastAsia"/>
+          <w:lang w:val="en-US" w:eastAsia="zh-CN"/>
+        </w:rPr>
+        <w:t>supplier-outbound-status-view – Control hiển thị trạng thái phiếu xuất kho, dùng để hiển thị tên trạng thái tương ứng với các giá trị trạng thái khác nhau.</w:t>
+      </w:r>
+    </w:p>
+    <w:p>
+      <w:pPr>
+        <w:rPr>
+          <w:rFonts w:hint="default"/>
+          <w:lang w:val="en-US" w:eastAsia="zh-CN"/>
+        </w:rPr>
+      </w:pPr>
+      <w:r>
+        <w:rPr>
+          <w:rFonts w:hint="default"/>
+          <w:lang w:val="en-US" w:eastAsia="zh-CN"/>
+        </w:rPr>
+        <w:t>supplier-select – Control chọn nhà cung cấp.</w:t>
+      </w:r>
+      <w:r>
+        <w:rPr>
+          <w:rFonts w:hint="eastAsia"/>
+          <w:lang w:val="en-US" w:eastAsia="zh-CN"/>
+        </w:rPr>
+      </w:r>
+    </w:p>
+    <w:p>
+      <w:pPr>
+        <w:rPr>
+          <w:rFonts w:hint="default"/>
+          <w:lang w:val="en-US" w:eastAsia="zh-CN"/>
+        </w:rPr>
+      </w:pPr>
+      <w:r>
+        <w:rPr>
+          <w:rFonts w:hint="default"/>
+          <w:lang w:val="en-US" w:eastAsia="zh-CN"/>
+        </w:rPr>
+        <w:t>addstorageTo – Giao diện thêm và sửa phiếu xuất kho; đây là cách viết đã được tối ưu và sửa đổi trên cơ sở control giao diện phiếu xuất kho gốc, có thể làm tham khảo cho các control cửa sổ bật lên khác. Không còn chỉ cung cấp giao diện như trước, để trang gọi xử lý control cửa sổ bật lên; nay toàn bộ logic đều được đóng gói trong control.</w:t>
+      </w:r>
+      <w:r>
+        <w:rPr>
+          <w:rFonts w:hint="eastAsia"/>
+          <w:lang w:val="en-US" w:eastAsia="zh-CN"/>
+        </w:rPr>
       </w:r>
     </w:p>
     <w:sectPr>

</xml_diff>